<commit_message>
R1: add journal-only upload package sensors-4470240_R1.zip (manuscript, tracked changes, three response letters, latex_source, verification scripts); letters now cite the filenames as shipped
</commit_message>
<xml_diff>
--- a/paper/mdpi_sensors/revision/response_to_reviewer_1.docx
+++ b/paper/mdpi_sensors/revision/response_to_reviewer_1.docx
@@ -505,7 +505,7 @@
         <w:rPr>
           <w:rStyle w:val="VerbatimChar"/>
         </w:rPr>
-        <w:t xml:space="preserve">main_tracked_changes.pdf</w:t>
+        <w:t xml:space="preserve">tracked_changes.pdf</w:t>
       </w:r>
       <w:r>
         <w:t xml:space="preserve">, latexdiff against the reviewed version) accompanies this letter.</w:t>
@@ -1939,16 +1939,19 @@
         <w:pStyle w:val="FirstParagraph"/>
       </w:pPr>
       <w:r>
-        <w:t xml:space="preserve">Before making any statistical change we reproduced the published Experiment-5 per-seed results bit-exactly from the pinned seeds (all five Wilcoxon p-values match the published values to six significant digits), and all figure regenerations are rendering-only (numerical outputs byte-identical). The re-analysis and sensitivity scripts, with their outputs, are included in the revision package (</w:t>
+        <w:t xml:space="preserve">Before making any statistical change we reproduced the published Experiment-5 per-seed results bit-exactly from the pinned seeds (all five Wilcoxon p-values match the published values to six significant digits), and all figure regenerations are rendering-only (numerical outputs byte-identical). The re-analysis and sensitivity scripts, with their outputs, are included in the accompanying package (</w:t>
       </w:r>
       <w:r>
         <w:rPr>
           <w:rStyle w:val="VerbatimChar"/>
         </w:rPr>
-        <w:t xml:space="preserve">revision/exp5_reanalysis.py</w:t>
-      </w:r>
-      <w:r>
-        <w:t xml:space="preserve">,</w:t>
+        <w:t xml:space="preserve">verification_scripts/exp5_reanalysis.py</w:t>
+      </w:r>
+      <w:r>
+        <w:t xml:space="preserve"> </w:t>
+      </w:r>
+      <w:r>
+        <w:t xml:space="preserve">and</w:t>
       </w:r>
       <w:r>
         <w:t xml:space="preserve"> </w:t>
@@ -1957,10 +1960,10 @@
         <w:rPr>
           <w:rStyle w:val="VerbatimChar"/>
         </w:rPr>
-        <w:t xml:space="preserve">revision/encoder_sensitivity.py</w:t>
-      </w:r>
-      <w:r>
-        <w:t xml:space="preserve">, and</w:t>
+        <w:t xml:space="preserve">verification_scripts/encoder_sensitivity.py</w:t>
+      </w:r>
+      <w:r>
+        <w:t xml:space="preserve">;</w:t>
       </w:r>
       <w:r>
         <w:t xml:space="preserve"> </w:t>
@@ -1975,7 +1978,7 @@
         <w:t xml:space="preserve"> </w:t>
       </w:r>
       <w:r>
-        <w:t xml:space="preserve">in the repository), and the reproducibility documentation was corrected and extended (exact seed indices per experiment; the previously missing Machine-Temperature download step).</w:t>
+        <w:t xml:space="preserve">in the public repository), and the reproducibility documentation was corrected and extended (exact seed indices per experiment; the previously missing Machine-Temperature download step).</w:t>
       </w:r>
     </w:p>
     <w:p>

</xml_diff>